<commit_message>
fix: elevate bullet rewriter quality, fix API response payload and match percentage display
</commit_message>
<xml_diff>
--- a/backend/test_resumes/sample_api_test.docx
+++ b/backend/test_resumes/sample_api_test.docx
@@ -7,12 +7,12 @@
         <w:pStyle w:val="Title"/>
       </w:pPr>
       <w:r>
-        <w:t>Jane Security Test</w:t>
+        <w:t>Jane Doe</w:t>
       </w:r>
     </w:p>
     <w:p>
       <w:r>
-        <w:t>Email: jane.security@tech.io | Phone: +1 555-000-1111</w:t>
+        <w:t>Email: jane.doe@tech.io | Phone: +1 555-999-8888</w:t>
       </w:r>
     </w:p>
     <w:p>
@@ -38,12 +38,25 @@
     </w:p>
     <w:p>
       <w:r>
-        <w:t>Senior Security Engineer - SafeTech | 2021 - Present</w:t>
+        <w:t>Senior Backend Engineer - Tech Solutions | 2021 - Present</w:t>
       </w:r>
     </w:p>
     <w:p>
       <w:r>
-        <w:t>• Implemented security validation controls and REST APIs.</w:t>
+        <w:t>• Architected FastAPI microservices handling millions of API calls daily.</w:t>
+      </w:r>
+    </w:p>
+    <w:p>
+      <w:pPr>
+        <w:pStyle w:val="Heading1"/>
+      </w:pPr>
+      <w:r>
+        <w:t>Education</w:t>
+      </w:r>
+    </w:p>
+    <w:p>
+      <w:r>
+        <w:t>Bachelor of Science in Software Engineering - MIT | 2017 - 2021</w:t>
       </w:r>
     </w:p>
     <w:sectPr>

</xml_diff>